<commit_message>
docs: add screenshots to lab-1 report
</commit_message>
<xml_diff>
--- a/docs/lab-1/report.docx
+++ b/docs/lab-1/report.docx
@@ -439,7 +439,6 @@
         <w:alias w:val="Содержание"/>
         <w:id w:val="-188602533"/>
       </w:sdtPr>
-      <w:sdtEndPr/>
       <w:sdtContent>
         <w:p>
           <w:pPr>
@@ -10340,7 +10339,128 @@
         <w:jc w:val="both"/>
       </w:pPr>
       <w:r>
-        <w:t>Внешний вид приложения приведён на рисунках 1–4.</w:t>
+        <w:t>Внешний вид приложения приведён на рисунках 1–4</w:t>
+      </w:r>
+    </w:p>
+    <w:p/>
+    <w:p>
+      <w:pPr>
+        <w:jc w:val="center"/>
+      </w:pPr>
+      <w:r>
+        <w:drawing>
+          <wp:inline distT="0" distB="0" distL="0" distR="0" wp14:anchorId="2D7D92C8" wp14:editId="39C9EEB3">
+            <wp:extent cx="3112119" cy="2012315"/>
+            <wp:effectExtent l="0" t="0" r="0" b="0"/>
+            <wp:docPr id="74333018" name="Рисунок 1"/>
+            <wp:cNvGraphicFramePr>
+              <a:graphicFrameLocks xmlns:a="http://schemas.openxmlformats.org/drawingml/2006/main" noChangeAspect="1"/>
+            </wp:cNvGraphicFramePr>
+            <a:graphic xmlns:a="http://schemas.openxmlformats.org/drawingml/2006/main">
+              <a:graphicData uri="http://schemas.openxmlformats.org/drawingml/2006/picture">
+                <pic:pic xmlns:pic="http://schemas.openxmlformats.org/drawingml/2006/picture">
+                  <pic:nvPicPr>
+                    <pic:cNvPr id="74333018" name=""/>
+                    <pic:cNvPicPr/>
+                  </pic:nvPicPr>
+                  <pic:blipFill>
+                    <a:blip r:embed="rId7"/>
+                    <a:stretch>
+                      <a:fillRect/>
+                    </a:stretch>
+                  </pic:blipFill>
+                  <pic:spPr>
+                    <a:xfrm>
+                      <a:off x="0" y="0"/>
+                      <a:ext cx="3125125" cy="2020724"/>
+                    </a:xfrm>
+                    <a:prstGeom prst="rect">
+                      <a:avLst/>
+                    </a:prstGeom>
+                  </pic:spPr>
+                </pic:pic>
+              </a:graphicData>
+            </a:graphic>
+          </wp:inline>
+        </w:drawing>
+      </w:r>
+    </w:p>
+    <w:p>
+      <w:pPr>
+        <w:jc w:val="center"/>
+      </w:pPr>
+    </w:p>
+    <w:p>
+      <w:pPr>
+        <w:jc w:val="center"/>
+      </w:pPr>
+      <w:r>
+        <w:rPr>
+          <w:sz w:val="24"/>
+          <w:szCs w:val="24"/>
+        </w:rPr>
+        <w:t>Рисунок 1 — Экран-список запусков</w:t>
+      </w:r>
+    </w:p>
+    <w:p/>
+    <w:p/>
+    <w:p>
+      <w:pPr>
+        <w:jc w:val="center"/>
+      </w:pPr>
+      <w:r>
+        <w:drawing>
+          <wp:inline distT="0" distB="0" distL="0" distR="0" wp14:anchorId="50203075" wp14:editId="1615094E">
+            <wp:extent cx="3818028" cy="2355709"/>
+            <wp:effectExtent l="0" t="0" r="5080" b="0"/>
+            <wp:docPr id="1654655010" name="Рисунок 1"/>
+            <wp:cNvGraphicFramePr>
+              <a:graphicFrameLocks xmlns:a="http://schemas.openxmlformats.org/drawingml/2006/main" noChangeAspect="1"/>
+            </wp:cNvGraphicFramePr>
+            <a:graphic xmlns:a="http://schemas.openxmlformats.org/drawingml/2006/main">
+              <a:graphicData uri="http://schemas.openxmlformats.org/drawingml/2006/picture">
+                <pic:pic xmlns:pic="http://schemas.openxmlformats.org/drawingml/2006/picture">
+                  <pic:nvPicPr>
+                    <pic:cNvPr id="1654655010" name=""/>
+                    <pic:cNvPicPr/>
+                  </pic:nvPicPr>
+                  <pic:blipFill>
+                    <a:blip r:embed="rId8"/>
+                    <a:stretch>
+                      <a:fillRect/>
+                    </a:stretch>
+                  </pic:blipFill>
+                  <pic:spPr>
+                    <a:xfrm>
+                      <a:off x="0" y="0"/>
+                      <a:ext cx="3857375" cy="2379986"/>
+                    </a:xfrm>
+                    <a:prstGeom prst="rect">
+                      <a:avLst/>
+                    </a:prstGeom>
+                  </pic:spPr>
+                </pic:pic>
+              </a:graphicData>
+            </a:graphic>
+          </wp:inline>
+        </w:drawing>
+      </w:r>
+    </w:p>
+    <w:p>
+      <w:pPr>
+        <w:jc w:val="center"/>
+      </w:pPr>
+    </w:p>
+    <w:p>
+      <w:pPr>
+        <w:jc w:val="center"/>
+      </w:pPr>
+      <w:r>
+        <w:rPr>
+          <w:sz w:val="24"/>
+          <w:szCs w:val="24"/>
+        </w:rPr>
+        <w:t>Рисунок 2 — Экран детали запуска</w:t>
       </w:r>
     </w:p>
     <w:p/>
@@ -10348,10 +10468,56 @@
     <w:p/>
     <w:p/>
     <w:p/>
-    <w:p/>
-    <w:p>
-      <w:pPr>
-        <w:spacing w:before="120" w:after="240" w:line="312" w:lineRule="auto"/>
+    <w:p>
+      <w:pPr>
+        <w:jc w:val="center"/>
+      </w:pPr>
+      <w:r>
+        <w:lastRenderedPageBreak/>
+        <w:drawing>
+          <wp:inline distT="0" distB="0" distL="0" distR="0" wp14:anchorId="18AE46FF" wp14:editId="2721E222">
+            <wp:extent cx="4359980" cy="2527437"/>
+            <wp:effectExtent l="0" t="0" r="0" b="0"/>
+            <wp:docPr id="1988246113" name="Рисунок 1"/>
+            <wp:cNvGraphicFramePr>
+              <a:graphicFrameLocks xmlns:a="http://schemas.openxmlformats.org/drawingml/2006/main" noChangeAspect="1"/>
+            </wp:cNvGraphicFramePr>
+            <a:graphic xmlns:a="http://schemas.openxmlformats.org/drawingml/2006/main">
+              <a:graphicData uri="http://schemas.openxmlformats.org/drawingml/2006/picture">
+                <pic:pic xmlns:pic="http://schemas.openxmlformats.org/drawingml/2006/picture">
+                  <pic:nvPicPr>
+                    <pic:cNvPr id="1988246113" name=""/>
+                    <pic:cNvPicPr/>
+                  </pic:nvPicPr>
+                  <pic:blipFill>
+                    <a:blip r:embed="rId9"/>
+                    <a:stretch>
+                      <a:fillRect/>
+                    </a:stretch>
+                  </pic:blipFill>
+                  <pic:spPr>
+                    <a:xfrm>
+                      <a:off x="0" y="0"/>
+                      <a:ext cx="4384375" cy="2541579"/>
+                    </a:xfrm>
+                    <a:prstGeom prst="rect">
+                      <a:avLst/>
+                    </a:prstGeom>
+                  </pic:spPr>
+                </pic:pic>
+              </a:graphicData>
+            </a:graphic>
+          </wp:inline>
+        </w:drawing>
+      </w:r>
+    </w:p>
+    <w:p>
+      <w:pPr>
+        <w:jc w:val="center"/>
+      </w:pPr>
+    </w:p>
+    <w:p>
+      <w:pPr>
         <w:jc w:val="center"/>
       </w:pPr>
       <w:r>
@@ -10359,18 +10525,59 @@
           <w:sz w:val="24"/>
           <w:szCs w:val="24"/>
         </w:rPr>
-        <w:t>Рисунок 1 — Экран-список запусков</w:t>
+        <w:t>Рисунок 3 — Тёмная тема</w:t>
       </w:r>
     </w:p>
     <w:p/>
-    <w:p/>
-    <w:p/>
-    <w:p/>
-    <w:p/>
-    <w:p/>
-    <w:p>
-      <w:pPr>
-        <w:spacing w:before="120" w:after="240" w:line="312" w:lineRule="auto"/>
+    <w:p>
+      <w:pPr>
+        <w:jc w:val="center"/>
+      </w:pPr>
+      <w:r>
+        <w:drawing>
+          <wp:inline distT="0" distB="0" distL="0" distR="0" wp14:anchorId="321116E2" wp14:editId="321C49EF">
+            <wp:extent cx="4166080" cy="1497651"/>
+            <wp:effectExtent l="0" t="0" r="0" b="1270"/>
+            <wp:docPr id="1227209145" name="Рисунок 1"/>
+            <wp:cNvGraphicFramePr>
+              <a:graphicFrameLocks xmlns:a="http://schemas.openxmlformats.org/drawingml/2006/main" noChangeAspect="1"/>
+            </wp:cNvGraphicFramePr>
+            <a:graphic xmlns:a="http://schemas.openxmlformats.org/drawingml/2006/main">
+              <a:graphicData uri="http://schemas.openxmlformats.org/drawingml/2006/picture">
+                <pic:pic xmlns:pic="http://schemas.openxmlformats.org/drawingml/2006/picture">
+                  <pic:nvPicPr>
+                    <pic:cNvPr id="1227209145" name=""/>
+                    <pic:cNvPicPr/>
+                  </pic:nvPicPr>
+                  <pic:blipFill>
+                    <a:blip r:embed="rId10"/>
+                    <a:stretch>
+                      <a:fillRect/>
+                    </a:stretch>
+                  </pic:blipFill>
+                  <pic:spPr>
+                    <a:xfrm>
+                      <a:off x="0" y="0"/>
+                      <a:ext cx="4256002" cy="1529977"/>
+                    </a:xfrm>
+                    <a:prstGeom prst="rect">
+                      <a:avLst/>
+                    </a:prstGeom>
+                  </pic:spPr>
+                </pic:pic>
+              </a:graphicData>
+            </a:graphic>
+          </wp:inline>
+        </w:drawing>
+      </w:r>
+    </w:p>
+    <w:p>
+      <w:pPr>
+        <w:jc w:val="center"/>
+      </w:pPr>
+    </w:p>
+    <w:p>
+      <w:pPr>
         <w:jc w:val="center"/>
       </w:pPr>
       <w:r>
@@ -10378,50 +10585,11 @@
           <w:sz w:val="24"/>
           <w:szCs w:val="24"/>
         </w:rPr>
-        <w:t>Рисунок 2 — Экран детали запуска</w:t>
-      </w:r>
-    </w:p>
-    <w:p/>
-    <w:p/>
-    <w:p/>
-    <w:p/>
-    <w:p/>
-    <w:p/>
-    <w:p>
-      <w:pPr>
-        <w:spacing w:before="120" w:after="240" w:line="312" w:lineRule="auto"/>
-        <w:jc w:val="center"/>
-      </w:pPr>
-      <w:r>
-        <w:rPr>
-          <w:sz w:val="24"/>
-          <w:szCs w:val="24"/>
-        </w:rPr>
-        <w:t>Рисунок 3 — Тёмная тема</w:t>
-      </w:r>
-    </w:p>
-    <w:p/>
-    <w:p/>
-    <w:p/>
-    <w:p/>
-    <w:p/>
-    <w:p/>
-    <w:p>
-      <w:pPr>
-        <w:spacing w:before="120" w:after="240" w:line="312" w:lineRule="auto"/>
-        <w:jc w:val="center"/>
-      </w:pPr>
-      <w:r>
-        <w:rPr>
-          <w:sz w:val="24"/>
-          <w:szCs w:val="24"/>
-        </w:rPr>
         <w:t>Рисунок 4 — Интерфейс на второй локали</w:t>
       </w:r>
     </w:p>
     <w:p>
       <w:r>
-        <w:lastRenderedPageBreak/>
         <w:br w:type="page"/>
       </w:r>
     </w:p>
@@ -10694,7 +10862,7 @@
       </w:r>
     </w:p>
     <w:sectPr>
-      <w:footerReference w:type="default" r:id="rId7"/>
+      <w:footerReference w:type="default" r:id="rId11"/>
       <w:pgSz w:w="11906" w:h="16838"/>
       <w:pgMar w:top="1134" w:right="850" w:bottom="1134" w:left="1701" w:header="708" w:footer="708" w:gutter="0"/>
       <w:cols w:space="720"/>

</xml_diff>

<commit_message>
docs: update report screenshots
</commit_message>
<xml_diff>
--- a/docs/lab-1/report.docx
+++ b/docs/lab-1/report.docx
@@ -10348,11 +10348,14 @@
         <w:jc w:val="center"/>
       </w:pPr>
       <w:r>
+        <w:rPr>
+          <w:noProof/>
+        </w:rPr>
         <w:drawing>
-          <wp:inline distT="0" distB="0" distL="0" distR="0" wp14:anchorId="2D7D92C8" wp14:editId="39C9EEB3">
-            <wp:extent cx="3112119" cy="2012315"/>
-            <wp:effectExtent l="0" t="0" r="0" b="0"/>
-            <wp:docPr id="74333018" name="Рисунок 1"/>
+          <wp:inline distT="0" distB="0" distL="0" distR="0" wp14:anchorId="2487634E" wp14:editId="067DA645">
+            <wp:extent cx="4409311" cy="2535766"/>
+            <wp:effectExtent l="0" t="0" r="0" b="4445"/>
+            <wp:docPr id="604704515" name="Рисунок 1"/>
             <wp:cNvGraphicFramePr>
               <a:graphicFrameLocks xmlns:a="http://schemas.openxmlformats.org/drawingml/2006/main" noChangeAspect="1"/>
             </wp:cNvGraphicFramePr>
@@ -10360,7 +10363,7 @@
               <a:graphicData uri="http://schemas.openxmlformats.org/drawingml/2006/picture">
                 <pic:pic xmlns:pic="http://schemas.openxmlformats.org/drawingml/2006/picture">
                   <pic:nvPicPr>
-                    <pic:cNvPr id="74333018" name=""/>
+                    <pic:cNvPr id="604704515" name=""/>
                     <pic:cNvPicPr/>
                   </pic:nvPicPr>
                   <pic:blipFill>
@@ -10372,7 +10375,7 @@
                   <pic:spPr>
                     <a:xfrm>
                       <a:off x="0" y="0"/>
-                      <a:ext cx="3125125" cy="2020724"/>
+                      <a:ext cx="4430444" cy="2547920"/>
                     </a:xfrm>
                     <a:prstGeom prst="rect">
                       <a:avLst/>
@@ -10409,11 +10412,14 @@
         <w:jc w:val="center"/>
       </w:pPr>
       <w:r>
+        <w:rPr>
+          <w:noProof/>
+        </w:rPr>
         <w:drawing>
-          <wp:inline distT="0" distB="0" distL="0" distR="0" wp14:anchorId="50203075" wp14:editId="1615094E">
-            <wp:extent cx="3818028" cy="2355709"/>
-            <wp:effectExtent l="0" t="0" r="5080" b="0"/>
-            <wp:docPr id="1654655010" name="Рисунок 1"/>
+          <wp:inline distT="0" distB="0" distL="0" distR="0" wp14:anchorId="0A79262B" wp14:editId="6EACE007">
+            <wp:extent cx="4522611" cy="2817507"/>
+            <wp:effectExtent l="0" t="0" r="0" b="1905"/>
+            <wp:docPr id="271649073" name="Рисунок 1"/>
             <wp:cNvGraphicFramePr>
               <a:graphicFrameLocks xmlns:a="http://schemas.openxmlformats.org/drawingml/2006/main" noChangeAspect="1"/>
             </wp:cNvGraphicFramePr>
@@ -10421,7 +10427,7 @@
               <a:graphicData uri="http://schemas.openxmlformats.org/drawingml/2006/picture">
                 <pic:pic xmlns:pic="http://schemas.openxmlformats.org/drawingml/2006/picture">
                   <pic:nvPicPr>
-                    <pic:cNvPr id="1654655010" name=""/>
+                    <pic:cNvPr id="271649073" name=""/>
                     <pic:cNvPicPr/>
                   </pic:nvPicPr>
                   <pic:blipFill>
@@ -10433,7 +10439,7 @@
                   <pic:spPr>
                     <a:xfrm>
                       <a:off x="0" y="0"/>
-                      <a:ext cx="3857375" cy="2379986"/>
+                      <a:ext cx="4535864" cy="2825764"/>
                     </a:xfrm>
                     <a:prstGeom prst="rect">
                       <a:avLst/>
@@ -10460,25 +10466,30 @@
           <w:sz w:val="24"/>
           <w:szCs w:val="24"/>
         </w:rPr>
-        <w:t>Рисунок 2 — Экран детали запуска</w:t>
-      </w:r>
-    </w:p>
-    <w:p/>
-    <w:p/>
-    <w:p/>
-    <w:p/>
-    <w:p/>
+        <w:t>Рисунок 2 — Экран детали запуск</w:t>
+      </w:r>
+      <w:r>
+        <w:rPr>
+          <w:sz w:val="24"/>
+          <w:szCs w:val="24"/>
+        </w:rPr>
+        <w:t>а</w:t>
+      </w:r>
+    </w:p>
     <w:p>
       <w:pPr>
         <w:jc w:val="center"/>
       </w:pPr>
       <w:r>
+        <w:rPr>
+          <w:noProof/>
+        </w:rPr>
         <w:lastRenderedPageBreak/>
         <w:drawing>
-          <wp:inline distT="0" distB="0" distL="0" distR="0" wp14:anchorId="18AE46FF" wp14:editId="2721E222">
-            <wp:extent cx="4359980" cy="2527437"/>
-            <wp:effectExtent l="0" t="0" r="0" b="0"/>
-            <wp:docPr id="1988246113" name="Рисунок 1"/>
+          <wp:inline distT="0" distB="0" distL="0" distR="0" wp14:anchorId="2FFD1E41" wp14:editId="6D40BA7F">
+            <wp:extent cx="4556125" cy="2823775"/>
+            <wp:effectExtent l="0" t="0" r="3175" b="0"/>
+            <wp:docPr id="1133914386" name="Рисунок 1"/>
             <wp:cNvGraphicFramePr>
               <a:graphicFrameLocks xmlns:a="http://schemas.openxmlformats.org/drawingml/2006/main" noChangeAspect="1"/>
             </wp:cNvGraphicFramePr>
@@ -10486,7 +10497,7 @@
               <a:graphicData uri="http://schemas.openxmlformats.org/drawingml/2006/picture">
                 <pic:pic xmlns:pic="http://schemas.openxmlformats.org/drawingml/2006/picture">
                   <pic:nvPicPr>
-                    <pic:cNvPr id="1988246113" name=""/>
+                    <pic:cNvPr id="1133914386" name=""/>
                     <pic:cNvPicPr/>
                   </pic:nvPicPr>
                   <pic:blipFill>
@@ -10498,7 +10509,7 @@
                   <pic:spPr>
                     <a:xfrm>
                       <a:off x="0" y="0"/>
-                      <a:ext cx="4384375" cy="2541579"/>
+                      <a:ext cx="4568235" cy="2831281"/>
                     </a:xfrm>
                     <a:prstGeom prst="rect">
                       <a:avLst/>
@@ -10534,11 +10545,14 @@
         <w:jc w:val="center"/>
       </w:pPr>
       <w:r>
+        <w:rPr>
+          <w:noProof/>
+        </w:rPr>
         <w:drawing>
-          <wp:inline distT="0" distB="0" distL="0" distR="0" wp14:anchorId="321116E2" wp14:editId="321C49EF">
-            <wp:extent cx="4166080" cy="1497651"/>
-            <wp:effectExtent l="0" t="0" r="0" b="1270"/>
-            <wp:docPr id="1227209145" name="Рисунок 1"/>
+          <wp:inline distT="0" distB="0" distL="0" distR="0" wp14:anchorId="30BA9AEB" wp14:editId="5FB7AFC8">
+            <wp:extent cx="5940425" cy="1576070"/>
+            <wp:effectExtent l="0" t="0" r="3175" b="0"/>
+            <wp:docPr id="1363271862" name="Рисунок 1"/>
             <wp:cNvGraphicFramePr>
               <a:graphicFrameLocks xmlns:a="http://schemas.openxmlformats.org/drawingml/2006/main" noChangeAspect="1"/>
             </wp:cNvGraphicFramePr>
@@ -10546,7 +10560,7 @@
               <a:graphicData uri="http://schemas.openxmlformats.org/drawingml/2006/picture">
                 <pic:pic xmlns:pic="http://schemas.openxmlformats.org/drawingml/2006/picture">
                   <pic:nvPicPr>
-                    <pic:cNvPr id="1227209145" name=""/>
+                    <pic:cNvPr id="1363271862" name=""/>
                     <pic:cNvPicPr/>
                   </pic:nvPicPr>
                   <pic:blipFill>
@@ -10558,7 +10572,7 @@
                   <pic:spPr>
                     <a:xfrm>
                       <a:off x="0" y="0"/>
-                      <a:ext cx="4256002" cy="1529977"/>
+                      <a:ext cx="5940425" cy="1576070"/>
                     </a:xfrm>
                     <a:prstGeom prst="rect">
                       <a:avLst/>

</xml_diff>